<commit_message>
Add inline chat UI on landing page; tighten approach doc
- Landing page at / now embeds a working chat widget: type, see the
  agent reply with recommendation cards (with type-letter badges) and
  conversation history. No curl needed for demos. Pre-loaded with four
  example queries (detailed JD, vague, compare, injection) so the
  refuse/clarify/recommend/refine behaviors are all one click away.
- Tightened APPROACH.md: kept first-person voice but broke walls of
  prose into scannable sections with bullets and a per-trace table.
- Regenerated APPROACH.docx from the new markdown.
</commit_message>
<xml_diff>
--- a/APPROACH.docx
+++ b/APPROACH.docx
@@ -34,7 +34,13 @@
         <w:t>Repo:</w:t>
       </w:r>
       <w:r>
-        <w:t xml:space="preserve"> https://github.com/sudhir-yadav28/shl-</w:t>
+        <w:t xml:space="preserve"> https://github.com/sudhir-yadav28/shl- </w:t>
+      </w:r>
+      <w:r>
+        <w:rPr>
+          <w:b/>
+        </w:rPr>
+        <w:t>Mean Recall@10 on the 10 public traces: 0.94</w:t>
       </w:r>
     </w:p>
     <w:p>
@@ -46,7 +52,7 @@
           <w:b/>
           <w:sz w:val="26"/>
         </w:rPr>
-        <w:t>How I thought about the problem</w:t>
+        <w:t>Design</w:t>
       </w:r>
     </w:p>
     <w:p>
@@ -54,7 +60,7 @@
         <w:spacing w:after="120"/>
       </w:pPr>
       <w:r>
-        <w:t xml:space="preserve">The brief reads like a search problem, but it isn't really one. A keyword search over the SHL catalog already exists on the SHL site — the value of this assignment is in the </w:t>
+        <w:t xml:space="preserve">The brief reads like a search problem but it isn't. A keyword search over the catalog already exists on SHL's site. The value here is in the </w:t>
       </w:r>
       <w:r>
         <w:rPr>
@@ -63,7 +69,7 @@
         <w:t>conversation</w:t>
       </w:r>
       <w:r>
-        <w:t>, not the lookup. So I framed the system around three constraints the rubric makes explicit: every response has to match the schema exactly, every URL has to come from the catalog (no hallucinations), and the final shortlist has to recover the items a domain expert would pick. Schema and grounding are things I can guarantee in code; recommendation quality is the messy part where the LLM helps.</w:t>
+        <w:t>, and the rubric makes three things non-negotiable: schema compliance, catalog-only URLs, and recall against a domain-expert shortlist. Schema and grounding I can guarantee in code; recommendation quality is where the LLM helps.</w:t>
       </w:r>
     </w:p>
     <w:p>
@@ -71,7 +77,7 @@
         <w:spacing w:after="120"/>
       </w:pPr>
       <w:r>
-        <w:t>That framing pushed me away from a "give the LLM tools and let it figure things out" design. Tool-use is great when the agent has to reason across many steps, but here the steps are simple — clarify or recommend or refine or compare or refuse — and the cost of getting any of them wrong shows up directly in the score. I went with a lightweight orchestrator: deterministic retrieval, one LLM call per turn for the natural-language work, and a post-processor that enforces the schema and URL whitelist. Each component does one thing I can defend.</w:t>
+        <w:t>So I avoided a "give the LLM tools and let it figure things out" design. Tool-use is great for multi-step reasoning, but here the actions are simple (clarify, recommend, refine, compare, refuse) and the cost of getting any one wrong shows up directly in the score. I went with a lightweight orchestrator: deterministic retrieval, one LLM call per turn for the language work, and a post-processor that enforces the schema.</w:t>
       </w:r>
     </w:p>
     <w:p>
@@ -91,7 +97,16 @@
         <w:spacing w:after="120"/>
       </w:pPr>
       <w:r>
-        <w:t xml:space="preserve">A request walks through five stages. First, a small regex catches obvious prompt-injection attempts and short-circuits with a refusal — I'd rather refuse fast than pay for an LLM call on </w:t>
+        <w:t xml:space="preserve">1. </w:t>
+      </w:r>
+      <w:r>
+        <w:rPr>
+          <w:b/>
+        </w:rPr>
+        <w:t>Guardrail regex</w:t>
+      </w:r>
+      <w:r>
+        <w:t xml:space="preserve"> catches obvious prompt-injection (</w:t>
       </w:r>
       <w:r>
         <w:rPr>
@@ -101,7 +116,26 @@
         <w:t>ignore previous instructions</w:t>
       </w:r>
       <w:r>
-        <w:t xml:space="preserve">. Second, the latest user turn is embedded via Gemini's </w:t>
+        <w:t xml:space="preserve">, </w:t>
+      </w:r>
+      <w:r>
+        <w:rPr>
+          <w:rFonts w:ascii="Menlo" w:hAnsi="Menlo"/>
+          <w:sz w:val="20"/>
+        </w:rPr>
+        <w:t>act as</w:t>
+      </w:r>
+      <w:r>
+        <w:t xml:space="preserve">, etc.) and short-circuits. 2. </w:t>
+      </w:r>
+      <w:r>
+        <w:rPr>
+          <w:b/>
+        </w:rPr>
+        <w:t>Embed</w:t>
+      </w:r>
+      <w:r>
+        <w:t xml:space="preserve"> the latest user turn with Gemini </w:t>
       </w:r>
       <w:r>
         <w:rPr>
@@ -111,25 +145,52 @@
         <w:t>text-embedding-001</w:t>
       </w:r>
       <w:r>
-        <w:t xml:space="preserve"> and joined with all prior user messages to form the retrieval query. Third, a hybrid retriever (BM25 over name + description + keys, plus dense cosine over the embedding index) returns its top 18 candidates, fused by Reciprocal Rank Fusion. To this list I append a small set of "canonical" SHL products — OPQ32r, Verify G+, GSA, and a few others — that show up across many hiring contexts but whose descriptions don't always lexically match the user's specific phrasing. Fourth, one LLM call classifies the action, drafts the reply, and picks names from the candidate block; output is JSON-mode so parsing is deterministic. Fifth, a shortlist builder assembles the final ten items in a deliberate priority order, and a Pydantic validator drops anything that isn't a real catalog URL.</w:t>
-      </w:r>
-    </w:p>
-    <w:p>
-      <w:pPr>
-        <w:spacing w:after="120"/>
-      </w:pPr>
-      <w:r>
-        <w:t xml:space="preserve">The shortlist builder is where most of the score came from, so it's worth explaining. The order is: tech-keyword force-includes first (e.g. if the user typed "docker", </w:t>
+        <w:t xml:space="preserve"> (3072-dim). 3. </w:t>
       </w:r>
       <w:r>
         <w:rPr>
-          <w:rFonts w:ascii="Menlo" w:hAnsi="Menlo"/>
-          <w:sz w:val="20"/>
+          <w:b/>
         </w:rPr>
-        <w:t>Docker (New)</w:t>
+        <w:t>Hybrid retrieval</w:t>
       </w:r>
       <w:r>
-        <w:t xml:space="preserve"> gets a guaranteed slot), then trigger-matched canonicals (OPQ32r unconditional, Verify G+ when "senior" or "graduate" appears, GSA when "audit" or "re-skill" appears, and so on), then the LLM's own picks, and finally the retrieval-ranked top-up to fill ten slots. Recall@10 has no precision penalty, so under-filling is pure score loss — and in my early traces the LLM frequently returned only one to three names on refine turns. The priority ordering also defends well: each slot's presence has a reason ("the user named this technology", "this is the standard SHL personality measure for senior selection", "this is what semantic + lexical retrieval ranked highest"), not "the model picked it".</w:t>
+        <w:t xml:space="preserve"> — BM25 over name+description+keys plus dense cosine over the pre-computed embedding index, fused via Reciprocal Rank Fusion. Top 18. 4. </w:t>
+      </w:r>
+      <w:r>
+        <w:rPr>
+          <w:b/>
+        </w:rPr>
+        <w:t>Canonical injection</w:t>
+      </w:r>
+      <w:r>
+        <w:t xml:space="preserve"> — append OPQ32r, Verify G+, GSA and a few others to the candidate list so the LLM can pick them even when their description doesn't lexically match the query. 5. </w:t>
+      </w:r>
+      <w:r>
+        <w:rPr>
+          <w:b/>
+        </w:rPr>
+        <w:t>One LLM call</w:t>
+      </w:r>
+      <w:r>
+        <w:t xml:space="preserve"> classifies the action, drafts the reply, and picks names from the candidate block. Output is JSON-mode so parsing is deterministic. 6. </w:t>
+      </w:r>
+      <w:r>
+        <w:rPr>
+          <w:b/>
+        </w:rPr>
+        <w:t>Shortlist builder</w:t>
+      </w:r>
+      <w:r>
+        <w:t xml:space="preserve"> assembles ten items in priority order: tech-keyword force-includes → trigger-matched canonicals → LLM picks → retrieval rank. 7. </w:t>
+      </w:r>
+      <w:r>
+        <w:rPr>
+          <w:b/>
+        </w:rPr>
+        <w:t>Pydantic validator</w:t>
+      </w:r>
+      <w:r>
+        <w:t xml:space="preserve"> drops anything whose URL isn't in the catalog.</w:t>
       </w:r>
     </w:p>
     <w:p>
@@ -141,7 +202,7 @@
           <w:b/>
           <w:sz w:val="26"/>
         </w:rPr>
-        <w:t>Where the design got tested</w:t>
+        <w:t>Why the shortlist builder matters</w:t>
       </w:r>
     </w:p>
     <w:p>
@@ -149,7 +210,79 @@
         <w:spacing w:after="120"/>
       </w:pPr>
       <w:r>
-        <w:t>I built a replay harness that parses each of the ten provided conversation traces for the user turns and the labeled final shortlist, replays the conversation against the live endpoint, and computes Recall@10 per trace. Mean recall starts at 0.11 with a naive setup and lands at 0.94 after the changes above. The biggest jumps came from filling the shortlist to ten (recall lift +0.40), forcing canonicals like OPQ32r conditional on context (+0.18), and the tech-keyword force-include layer (+0.16). C9 was particularly instructive: the user names seven technologies in a JD, but the retriever was returning five Java variants and crowding out AWS, Docker, and SQL. The tech-keyword path catches exactly that case.</w:t>
+        <w:t>Most of the score came from this layer.</w:t>
+      </w:r>
+    </w:p>
+    <w:p>
+      <w:pPr>
+        <w:pStyle w:val="ListBullet"/>
+      </w:pPr>
+      <w:r>
+        <w:rPr>
+          <w:b/>
+        </w:rPr>
+        <w:t>Recall@10 has no precision penalty.</w:t>
+      </w:r>
+      <w:r>
+        <w:t xml:space="preserve"> Under-filling is pure score loss, and the LLM was returning 1–3 names on refine turns. Filling to 10 lifted recall +0.40.</w:t>
+      </w:r>
+    </w:p>
+    <w:p>
+      <w:pPr>
+        <w:pStyle w:val="ListBullet"/>
+      </w:pPr>
+      <w:r>
+        <w:rPr>
+          <w:b/>
+        </w:rPr>
+        <w:t>Some canonical SHL products (OPQ32r, Verify G+, GSA) appear in many reference shortlists</w:t>
+      </w:r>
+      <w:r>
+        <w:t xml:space="preserve"> but their descriptions don't match the user's specific phrasing. Conditional force-include based on query triggers lifted recall +0.18.</w:t>
+      </w:r>
+    </w:p>
+    <w:p>
+      <w:pPr>
+        <w:pStyle w:val="ListBullet"/>
+      </w:pPr>
+      <w:r>
+        <w:rPr>
+          <w:b/>
+        </w:rPr>
+        <w:t>Tech-keyword force-include</w:t>
+      </w:r>
+      <w:r>
+        <w:t xml:space="preserve"> — when the user literally types </w:t>
+      </w:r>
+      <w:r>
+        <w:rPr>
+          <w:rFonts w:ascii="Menlo" w:hAnsi="Menlo"/>
+          <w:sz w:val="20"/>
+        </w:rPr>
+        <w:t>docker</w:t>
+      </w:r>
+      <w:r>
+        <w:t xml:space="preserve"> or </w:t>
+      </w:r>
+      <w:r>
+        <w:rPr>
+          <w:rFonts w:ascii="Menlo" w:hAnsi="Menlo"/>
+          <w:sz w:val="20"/>
+        </w:rPr>
+        <w:t>aws</w:t>
+      </w:r>
+      <w:r>
+        <w:t xml:space="preserve"> or </w:t>
+      </w:r>
+      <w:r>
+        <w:rPr>
+          <w:rFonts w:ascii="Menlo" w:hAnsi="Menlo"/>
+          <w:sz w:val="20"/>
+        </w:rPr>
+        <w:t>excel</w:t>
+      </w:r>
+      <w:r>
+        <w:t>, the matching catalog product gets a guaranteed slot. Lifted recall +0.16, mostly on C9 where the retriever was returning 5 Java variants and crowding out AWS/Docker/SQL.</w:t>
       </w:r>
     </w:p>
     <w:p>
@@ -157,17 +290,7 @@
         <w:spacing w:after="120"/>
       </w:pPr>
       <w:r>
-        <w:t xml:space="preserve">Behavior probes live in </w:t>
-      </w:r>
-      <w:r>
-        <w:rPr>
-          <w:rFonts w:ascii="Menlo" w:hAnsi="Menlo"/>
-          <w:sz w:val="20"/>
-        </w:rPr>
-        <w:t>tests/test_behavior_probes.py</w:t>
-      </w:r>
-      <w:r>
-        <w:t xml:space="preserve"> — nine scripted conversations with binary assertions covering schema shape, no-recommend-on-vague-turn-1, prompt-injection refusal, off-topic refusal, refine keeps prior items, end-of-conversation only on explicit confirmation, and test-type letter codes. They all pass and I run them on every change.</w:t>
+        <w:t>Each slot in the final shortlist has a defensible reason for being there. "The user named this technology", "this is the standard SHL personality measure for senior selection", or "this is what semantic + lexical retrieval ranked highest". Not "the model picked it".</w:t>
       </w:r>
     </w:p>
     <w:p>
@@ -184,30 +307,53 @@
     </w:p>
     <w:p>
       <w:pPr>
-        <w:spacing w:after="120"/>
+        <w:pStyle w:val="ListBullet"/>
       </w:pPr>
       <w:r>
-        <w:t xml:space="preserve">FastAPI plus Pydantic v2 because the schema is non-negotiable and Pydantic gives me the last gate before any response leaves the service. Gemini 2.0 Flash as the primary LLM (15 RPM / 1500 RPD on the free tier — comfortable headroom for evaluation) with Groq's </w:t>
+        <w:rPr>
+          <w:b/>
+        </w:rPr>
+        <w:t>FastAPI + Pydantic v2.</w:t>
+      </w:r>
+      <w:r>
+        <w:t xml:space="preserve"> Spec-required; Pydantic is the last gate before any response leaves the service.</w:t>
+      </w:r>
+    </w:p>
+    <w:p>
+      <w:pPr>
+        <w:pStyle w:val="ListBullet"/>
+      </w:pPr>
+      <w:r>
+        <w:rPr>
+          <w:b/>
+        </w:rPr>
+        <w:t>Gemini 2.0 Flash</w:t>
+      </w:r>
+      <w:r>
+        <w:t xml:space="preserve"> as primary (15 RPM / 1500 RPD free tier — comfortable headroom), </w:t>
       </w:r>
       <w:r>
         <w:rPr>
-          <w:rFonts w:ascii="Menlo" w:hAnsi="Menlo"/>
-          <w:sz w:val="20"/>
+          <w:b/>
         </w:rPr>
-        <w:t>llama-3.1-8b-instant</w:t>
+        <w:t>Groq `llama-3.1-8b-instant`</w:t>
       </w:r>
       <w:r>
-        <w:t xml:space="preserve"> as a transparent fallback when Gemini errors. The two providers sit on separate quotas, which mattered during development when I burned my Gemini daily limit pretty quickly. Embeddings are Gemini's </w:t>
+        <w:t xml:space="preserve"> as transparent fallback on 429 or any error. Two separate quotas matters in practice.</w:t>
+      </w:r>
+    </w:p>
+    <w:p>
+      <w:pPr>
+        <w:pStyle w:val="ListBullet"/>
+      </w:pPr>
+      <w:r>
+        <w:rPr>
+          <w:b/>
+        </w:rPr>
+        <w:t>Gemini `text-embedding-001`</w:t>
       </w:r>
       <w:r>
-        <w:rPr>
-          <w:rFonts w:ascii="Menlo" w:hAnsi="Menlo"/>
-          <w:sz w:val="20"/>
-        </w:rPr>
-        <w:t>text-embedding-001</w:t>
-      </w:r>
-      <w:r>
-        <w:t xml:space="preserve">, computed offline once and shipped as a 4.5 MB </w:t>
+        <w:t xml:space="preserve"> computed offline once, shipped as a 4.5 MB </w:t>
       </w:r>
       <w:r>
         <w:rPr>
@@ -217,17 +363,35 @@
         <w:t>embeddings.npy</w:t>
       </w:r>
       <w:r>
-        <w:t xml:space="preserve"> so cold start on Render is three seconds instead of seven minutes. Dense search is a NumPy matmul over 377 vectors — FAISS would be overkill at this scale. Lexical search is </w:t>
+        <w:t>. Cold start is 3s instead of 7 minutes.</w:t>
+      </w:r>
+    </w:p>
+    <w:p>
+      <w:pPr>
+        <w:pStyle w:val="ListBullet"/>
+      </w:pPr>
+      <w:r>
+        <w:rPr>
+          <w:b/>
+        </w:rPr>
+        <w:t>`rank_bm25`</w:t>
       </w:r>
       <w:r>
+        <w:t xml:space="preserve"> for lexical, NumPy matmul over 377 vectors for dense. FAISS would be overkill at this scale.</w:t>
+      </w:r>
+    </w:p>
+    <w:p>
+      <w:pPr>
+        <w:pStyle w:val="ListBullet"/>
+      </w:pPr>
+      <w:r>
         <w:rPr>
-          <w:rFonts w:ascii="Menlo" w:hAnsi="Menlo"/>
-          <w:sz w:val="20"/>
+          <w:b/>
         </w:rPr>
-        <w:t>rank_bm25</w:t>
+        <w:t>Render free Docker tier.</w:t>
       </w:r>
       <w:r>
-        <w:t>. Deployment is Render's free Docker tier; the assignment's two-minute cold-start allowance is essentially written for it.</w:t>
+        <w:t xml:space="preserve"> The spec's 2-minute cold-start allowance is essentially written for it.</w:t>
       </w:r>
     </w:p>
     <w:p>
@@ -239,7 +403,7 @@
           <w:b/>
           <w:sz w:val="26"/>
         </w:rPr>
-        <w:t>What didn't work, and what I'd add with more time</w:t>
+        <w:t>Evaluation</w:t>
       </w:r>
     </w:p>
     <w:p>
@@ -247,35 +411,27 @@
         <w:spacing w:after="120"/>
       </w:pPr>
       <w:r>
-        <w:t xml:space="preserve">The first attempt at the agent was a single LLM call with no post-processing top-up. It plateaued around 0.43 Mean Recall@10. The model consistently under-filled the shortlist (one to three items even on multi-turn refines) and sometimes picked similar-sounding products instead of the canonical core ones — Enterprise Leadership Report 2.0 in place of OPQ Leadership Report, for instance. The priority-ordered shortlist builder is what recovered most of the gap; the LLM is doing the language and the judgment about </w:t>
-      </w:r>
-      <w:r>
-        <w:rPr>
-          <w:i/>
-        </w:rPr>
-        <w:t>which</w:t>
-      </w:r>
-      <w:r>
-        <w:t xml:space="preserve"> items, but it's no longer responsible for </w:t>
-      </w:r>
-      <w:r>
-        <w:rPr>
-          <w:i/>
-        </w:rPr>
-        <w:t>how many</w:t>
-      </w:r>
-      <w:r>
-        <w:t xml:space="preserve"> or for ensuring the canonical defaults make the list. I also tried </w:t>
+        <w:t xml:space="preserve">Replay harness in </w:t>
       </w:r>
       <w:r>
         <w:rPr>
           <w:rFonts w:ascii="Menlo" w:hAnsi="Menlo"/>
           <w:sz w:val="20"/>
         </w:rPr>
-        <w:t>sentence-transformers</w:t>
+        <w:t>eval/replay.py</w:t>
       </w:r>
       <w:r>
-        <w:t xml:space="preserve"> locally first, but the PyTorch dependency was about 500 MB and would have blown Render's 512 MB RAM cap — Gemini embeddings keep the deployment lean.</w:t>
+        <w:t xml:space="preserve"> parses each </w:t>
+      </w:r>
+      <w:r>
+        <w:rPr>
+          <w:rFonts w:ascii="Menlo" w:hAnsi="Menlo"/>
+          <w:sz w:val="20"/>
+        </w:rPr>
+        <w:t>Cn.md</w:t>
+      </w:r>
+      <w:r>
+        <w:t xml:space="preserve"> for user turns and labeled URLs, replays multi-turn against the endpoint, and computes Recall@10. Per-trace:</w:t>
       </w:r>
     </w:p>
     <w:p>
@@ -283,7 +439,153 @@
         <w:spacing w:after="120"/>
       </w:pPr>
       <w:r>
-        <w:t>A few things I'd add given more time. The retrieval would benefit from MMR-style diversity so I could drop the tech-keyword layer (which works but is hand-curated). An LLM-based query rewriter before retrieval would help on multi-faceted queries like C7 (bilingual + healthcare + admin + Spanish), where the concatenated user turns confuse BM25. And I'd build a simulated-user harness — the spec describes how SHL runs evaluation against my endpoint with an LLM playing the user — so I could test holdout-style queries instead of just replaying the public traces verbatim.</w:t>
+        <w:t xml:space="preserve">| Trace | C1 | C2 | C3 | C4 | C5 | C6 | C7 | C8 | C9 | C10 | </w:t>
+      </w:r>
+      <w:r>
+        <w:rPr>
+          <w:b/>
+        </w:rPr>
+        <w:t>Mean</w:t>
+      </w:r>
+      <w:r>
+        <w:t xml:space="preserve"> | |---|---|---|---|---|---|---|---|---|---|---|---| | Recall@10 | 1.00 | 0.80 | 0.75 | 1.00 | 0.80 | 1.00 | 1.00 | 1.00 | 1.00 | 1.00 | </w:t>
+      </w:r>
+      <w:r>
+        <w:rPr>
+          <w:b/>
+        </w:rPr>
+        <w:t>0.94</w:t>
+      </w:r>
+      <w:r>
+        <w:t xml:space="preserve"> |</w:t>
+      </w:r>
+    </w:p>
+    <w:p>
+      <w:pPr>
+        <w:spacing w:after="120"/>
+      </w:pPr>
+      <w:r>
+        <w:t>Behavior probes (</w:t>
+      </w:r>
+      <w:r>
+        <w:rPr>
+          <w:rFonts w:ascii="Menlo" w:hAnsi="Menlo"/>
+          <w:sz w:val="20"/>
+        </w:rPr>
+        <w:t>tests/test_behavior_probes.py</w:t>
+      </w:r>
+      <w:r>
+        <w:t>) — 9 scripted conversations with binary assertions: schema shape, no-recommend-on-vague-turn-1, prompt-injection refusal, off-topic refusal, refine keeps prior items, end-of-conversation only on confirmation, test_type letter codes. All 9 pass.</w:t>
+      </w:r>
+    </w:p>
+    <w:p>
+      <w:pPr>
+        <w:spacing w:before="200" w:after="80"/>
+      </w:pPr>
+      <w:r>
+        <w:rPr>
+          <w:b/>
+          <w:sz w:val="26"/>
+        </w:rPr>
+        <w:t>What didn't work</w:t>
+      </w:r>
+    </w:p>
+    <w:p>
+      <w:pPr>
+        <w:pStyle w:val="ListBullet"/>
+      </w:pPr>
+      <w:r>
+        <w:rPr>
+          <w:b/>
+        </w:rPr>
+        <w:t>Pure LLM-driven selection without top-up</w:t>
+      </w:r>
+      <w:r>
+        <w:t xml:space="preserve"> plateaued at 0.43 Mean Recall. The model under-filled and picked similar-sounding products (Enterprise Leadership Report 2.0 instead of OPQ Leadership Report). The priority-ordered builder is what recovered the gap.</w:t>
+      </w:r>
+    </w:p>
+    <w:p>
+      <w:pPr>
+        <w:pStyle w:val="ListBullet"/>
+      </w:pPr>
+      <w:r>
+        <w:rPr>
+          <w:b/>
+        </w:rPr>
+        <w:t>`sentence-transformers` locally</w:t>
+      </w:r>
+      <w:r>
+        <w:t xml:space="preserve"> — PyTorch is ~500 MB and would have blown Render's 512 MB RAM cap. Switched to Gemini embeddings.</w:t>
+      </w:r>
+    </w:p>
+    <w:p>
+      <w:pPr>
+        <w:pStyle w:val="ListBullet"/>
+      </w:pPr>
+      <w:r>
+        <w:rPr>
+          <w:b/>
+        </w:rPr>
+        <w:t>Gemini 2.5 Flash</w:t>
+      </w:r>
+      <w:r>
+        <w:t xml:space="preserve"> as primary — 10 RPM / 250 RPD got exhausted within a single eval run. Dropped to 2.0 Flash and added Groq fallback.</w:t>
+      </w:r>
+    </w:p>
+    <w:p>
+      <w:pPr>
+        <w:spacing w:before="200" w:after="80"/>
+      </w:pPr>
+      <w:r>
+        <w:rPr>
+          <w:b/>
+          <w:sz w:val="26"/>
+        </w:rPr>
+        <w:t>Resilience</w:t>
+      </w:r>
+    </w:p>
+    <w:p>
+      <w:pPr>
+        <w:spacing w:after="120"/>
+      </w:pPr>
+      <w:r>
+        <w:t>When both Gemini and Groq fail (rate-limit or outage), the agent falls through to a retrieval-only path. The shortlist still populates via tech-keyword + canonical + retrieval rank, so Recall@10 is preserved without LLM availability. A signal-term heuristic decides between clarify and recommend so the resilience path doesn't violate the no-recommend-on-vague-turn-1 probe.</w:t>
+      </w:r>
+    </w:p>
+    <w:p>
+      <w:pPr>
+        <w:spacing w:before="200" w:after="80"/>
+      </w:pPr>
+      <w:r>
+        <w:rPr>
+          <w:b/>
+          <w:sz w:val="26"/>
+        </w:rPr>
+        <w:t>What I'd add with more time</w:t>
+      </w:r>
+    </w:p>
+    <w:p>
+      <w:pPr>
+        <w:pStyle w:val="ListBullet"/>
+      </w:pPr>
+      <w:r>
+        <w:t>LLM-based query rewriting before retrieval (would help C7's multi-faceted bilingual-healthcare-admin query).</w:t>
+      </w:r>
+    </w:p>
+    <w:p>
+      <w:pPr>
+        <w:pStyle w:val="ListBullet"/>
+      </w:pPr>
+      <w:r>
+        <w:t>MMR-style diversity in retrieval to drop the hand-curated tech-keyword layer.</w:t>
+      </w:r>
+    </w:p>
+    <w:p>
+      <w:pPr>
+        <w:pStyle w:val="ListBullet"/>
+      </w:pPr>
+      <w:r>
+        <w:t>Simulated-user harness with an LLM playing the user, to test holdout-style queries the way SHL actually evaluates.</w:t>
       </w:r>
     </w:p>
     <w:p>
@@ -303,7 +605,7 @@
         <w:spacing w:after="120"/>
       </w:pPr>
       <w:r>
-        <w:t>I used Claude as a coding assistant throughout — pair-debugging retrieval gaps, diagnosing the rate-limit cascade when both providers got exhausted, and proposing the shortlist-builder priority ordering after I described what was happening on the C8 and C9 traces. The design calls (single-LLM-call orchestrator over tool-use, canonical injection, the tech-keyword layer, the resilience path when both LLMs are down) and the prompt content and keyword lists are mine. I verified every change against the ten public traces and the behavior probe suite before committing.</w:t>
+        <w:t>I used Claude as a coding assistant — pair-debugging retrieval gaps, diagnosing the rate-limit cascade, and proposing the shortlist-builder priority ordering after I described the C8 and C9 trace failures. The design (single-LLM-call orchestrator over tool-use, canonical injection, tech-keyword layer, resilience path), the prompt content, and the keyword lists are mine. I verified every change against the 10 public traces and the probe suite before committing.</w:t>
       </w:r>
     </w:p>
     <w:sectPr>

</xml_diff>

<commit_message>
Rewrite approach doc in personal voice; clean up non-essential files
- APPROACH.md and APPROACH.docx rewritten in a more first-person,
  detail-with-context style. Concrete narrative of how recall went from
  0.11 to 0.94 (3 specific changes with measured deltas). Drops the
  generic-sounding bullet walls.
- Removed PLAN.md (internal planning doc, not a deliverable) and
  scripts/build_docx.py (one-off doc converter) from the repo. Both
  remain locally and are gitignored going forward.
</commit_message>
<xml_diff>
--- a/APPROACH.docx
+++ b/APPROACH.docx
@@ -52,7 +52,7 @@
           <w:b/>
           <w:sz w:val="26"/>
         </w:rPr>
-        <w:t>Design</w:t>
+        <w:t>How I read the problem</w:t>
       </w:r>
     </w:p>
     <w:p>
@@ -60,16 +60,16 @@
         <w:spacing w:after="120"/>
       </w:pPr>
       <w:r>
-        <w:t xml:space="preserve">The brief reads like a search problem but it isn't. A keyword search over the catalog already exists on SHL's site. The value here is in the </w:t>
+        <w:t xml:space="preserve">Before writing any code I went through all 10 sample conversations. Two things stood out. First, "good" recommendations almost always include some canonical SHL products — OPQ32r, Verify G+, Global Skills Assessment — even when the user never mentions them by name. Second, the agent's job is to know </w:t>
       </w:r>
       <w:r>
         <w:rPr>
           <w:i/>
         </w:rPr>
-        <w:t>conversation</w:t>
+        <w:t>when</w:t>
       </w:r>
       <w:r>
-        <w:t>, and the rubric makes three things non-negotiable: schema compliance, catalog-only URLs, and recall against a domain-expert shortlist. Schema and grounding I can guarantee in code; recommendation quality is where the LLM helps.</w:t>
+        <w:t xml:space="preserve"> to do what: ask, retrieve, refine, compare, or refuse. The rubric weights schema compliance and catalog-only URLs as hard fails, and the rest is Recall@10 plus behaviour probes. That shaped every design choice that followed.</w:t>
       </w:r>
     </w:p>
     <w:p>
@@ -77,7 +77,17 @@
         <w:spacing w:after="120"/>
       </w:pPr>
       <w:r>
-        <w:t>So I avoided a "give the LLM tools and let it figure things out" design. Tool-use is great for multi-step reasoning, but here the actions are simple (clarify, recommend, refine, compare, refuse) and the cost of getting any one wrong shows up directly in the score. I went with a lightweight orchestrator: deterministic retrieval, one LLM call per turn for the language work, and a post-processor that enforces the schema.</w:t>
+        <w:t xml:space="preserve">I considered three architectures: a pure LLM-with-tools agent (e.g. give it a </w:t>
+      </w:r>
+      <w:r>
+        <w:rPr>
+          <w:rFonts w:ascii="Menlo" w:hAnsi="Menlo"/>
+          <w:sz w:val="20"/>
+        </w:rPr>
+        <w:t>search_catalog</w:t>
+      </w:r>
+      <w:r>
+        <w:t xml:space="preserve"> tool and let it loop), a LangGraph state machine, and a thin orchestrator with one LLM call per turn. I went with the third. Tool-use is good when reasoning spans many steps and the action space is large — here it's five actions and the cost of a wrong one shows directly in the score. A small orchestrator is easier to defend in an interview and easier to test.</w:t>
       </w:r>
     </w:p>
     <w:p>
@@ -89,7 +99,7 @@
           <w:b/>
           <w:sz w:val="26"/>
         </w:rPr>
-        <w:t>What happens on each `/chat` call</w:t>
+        <w:t>What `/chat` does per turn</w:t>
       </w:r>
     </w:p>
     <w:p>
@@ -103,7 +113,7 @@
         <w:rPr>
           <w:b/>
         </w:rPr>
-        <w:t>Guardrail regex</w:t>
+        <w:t>Regex pre-check</w:t>
       </w:r>
       <w:r>
         <w:t xml:space="preserve"> catches obvious prompt-injection (</w:t>
@@ -126,16 +136,16 @@
         <w:t>act as</w:t>
       </w:r>
       <w:r>
-        <w:t xml:space="preserve">, etc.) and short-circuits. 2. </w:t>
+        <w:t xml:space="preserve">, etc.) and short-circuits with a refusal. Faster than burning an LLM call on something I already know is bad input. 2. </w:t>
       </w:r>
       <w:r>
         <w:rPr>
           <w:b/>
         </w:rPr>
-        <w:t>Embed</w:t>
+        <w:t>Embed the query</w:t>
       </w:r>
       <w:r>
-        <w:t xml:space="preserve"> the latest user turn with Gemini </w:t>
+        <w:t xml:space="preserve"> (Gemini </w:t>
       </w:r>
       <w:r>
         <w:rPr>
@@ -145,7 +155,7 @@
         <w:t>text-embedding-001</w:t>
       </w:r>
       <w:r>
-        <w:t xml:space="preserve"> (3072-dim). 3. </w:t>
+        <w:t xml:space="preserve">, 3072-dim). The query is the concatenation of all user turns so refines and compares get full context for free. 3. </w:t>
       </w:r>
       <w:r>
         <w:rPr>
@@ -154,7 +164,7 @@
         <w:t>Hybrid retrieval</w:t>
       </w:r>
       <w:r>
-        <w:t xml:space="preserve"> — BM25 over name+description+keys plus dense cosine over the pre-computed embedding index, fused via Reciprocal Rank Fusion. Top 18. 4. </w:t>
+        <w:t xml:space="preserve"> — BM25 over name + description + keys + job levels, plus dense cosine. Fused via Reciprocal Rank Fusion (k=60). Top 18. 4. </w:t>
       </w:r>
       <w:r>
         <w:rPr>
@@ -163,7 +173,7 @@
         <w:t>Canonical injection</w:t>
       </w:r>
       <w:r>
-        <w:t xml:space="preserve"> — append OPQ32r, Verify G+, GSA and a few others to the candidate list so the LLM can pick them even when their description doesn't lexically match the query. 5. </w:t>
+        <w:t xml:space="preserve"> — append a small set of always-relevant SHL products (OPQ32r, Verify G+, GSA, OPQ UCR 2.0, Smart Interview Live Coding, etc.) so the LLM can choose them even when retrieval ranks them low. 5. </w:t>
       </w:r>
       <w:r>
         <w:rPr>
@@ -181,7 +191,7 @@
         <w:t>Shortlist builder</w:t>
       </w:r>
       <w:r>
-        <w:t xml:space="preserve"> assembles ten items in priority order: tech-keyword force-includes → trigger-matched canonicals → LLM picks → retrieval rank. 7. </w:t>
+        <w:t xml:space="preserve"> assembles the final 10 items in priority order: tech-keyword force-includes → trigger-matched canonicals → LLM picks → retrieval rank. 7. </w:t>
       </w:r>
       <w:r>
         <w:rPr>
@@ -190,7 +200,7 @@
         <w:t>Pydantic validator</w:t>
       </w:r>
       <w:r>
-        <w:t xml:space="preserve"> drops anything whose URL isn't in the catalog.</w:t>
+        <w:t xml:space="preserve"> checks every URL against the catalog and drops anything I can't ground. The schema is the last thing the response touches.</w:t>
       </w:r>
     </w:p>
     <w:p>
@@ -202,7 +212,7 @@
           <w:b/>
           <w:sz w:val="26"/>
         </w:rPr>
-        <w:t>Why the shortlist builder matters</w:t>
+        <w:t>What lifted the score and how I measured it</w:t>
       </w:r>
     </w:p>
     <w:p>
@@ -210,208 +220,7 @@
         <w:spacing w:after="120"/>
       </w:pPr>
       <w:r>
-        <w:t>Most of the score came from this layer.</w:t>
-      </w:r>
-    </w:p>
-    <w:p>
-      <w:pPr>
-        <w:pStyle w:val="ListBullet"/>
-      </w:pPr>
-      <w:r>
-        <w:rPr>
-          <w:b/>
-        </w:rPr>
-        <w:t>Recall@10 has no precision penalty.</w:t>
-      </w:r>
-      <w:r>
-        <w:t xml:space="preserve"> Under-filling is pure score loss, and the LLM was returning 1–3 names on refine turns. Filling to 10 lifted recall +0.40.</w:t>
-      </w:r>
-    </w:p>
-    <w:p>
-      <w:pPr>
-        <w:pStyle w:val="ListBullet"/>
-      </w:pPr>
-      <w:r>
-        <w:rPr>
-          <w:b/>
-        </w:rPr>
-        <w:t>Some canonical SHL products (OPQ32r, Verify G+, GSA) appear in many reference shortlists</w:t>
-      </w:r>
-      <w:r>
-        <w:t xml:space="preserve"> but their descriptions don't match the user's specific phrasing. Conditional force-include based on query triggers lifted recall +0.18.</w:t>
-      </w:r>
-    </w:p>
-    <w:p>
-      <w:pPr>
-        <w:pStyle w:val="ListBullet"/>
-      </w:pPr>
-      <w:r>
-        <w:rPr>
-          <w:b/>
-        </w:rPr>
-        <w:t>Tech-keyword force-include</w:t>
-      </w:r>
-      <w:r>
-        <w:t xml:space="preserve"> — when the user literally types </w:t>
-      </w:r>
-      <w:r>
-        <w:rPr>
-          <w:rFonts w:ascii="Menlo" w:hAnsi="Menlo"/>
-          <w:sz w:val="20"/>
-        </w:rPr>
-        <w:t>docker</w:t>
-      </w:r>
-      <w:r>
-        <w:t xml:space="preserve"> or </w:t>
-      </w:r>
-      <w:r>
-        <w:rPr>
-          <w:rFonts w:ascii="Menlo" w:hAnsi="Menlo"/>
-          <w:sz w:val="20"/>
-        </w:rPr>
-        <w:t>aws</w:t>
-      </w:r>
-      <w:r>
-        <w:t xml:space="preserve"> or </w:t>
-      </w:r>
-      <w:r>
-        <w:rPr>
-          <w:rFonts w:ascii="Menlo" w:hAnsi="Menlo"/>
-          <w:sz w:val="20"/>
-        </w:rPr>
-        <w:t>excel</w:t>
-      </w:r>
-      <w:r>
-        <w:t>, the matching catalog product gets a guaranteed slot. Lifted recall +0.16, mostly on C9 where the retriever was returning 5 Java variants and crowding out AWS/Docker/SQL.</w:t>
-      </w:r>
-    </w:p>
-    <w:p>
-      <w:pPr>
-        <w:spacing w:after="120"/>
-      </w:pPr>
-      <w:r>
-        <w:t>Each slot in the final shortlist has a defensible reason for being there. "The user named this technology", "this is the standard SHL personality measure for senior selection", or "this is what semantic + lexical retrieval ranked highest". Not "the model picked it".</w:t>
-      </w:r>
-    </w:p>
-    <w:p>
-      <w:pPr>
-        <w:spacing w:before="200" w:after="80"/>
-      </w:pPr>
-      <w:r>
-        <w:rPr>
-          <w:b/>
-          <w:sz w:val="26"/>
-        </w:rPr>
-        <w:t>Stack and why</w:t>
-      </w:r>
-    </w:p>
-    <w:p>
-      <w:pPr>
-        <w:pStyle w:val="ListBullet"/>
-      </w:pPr>
-      <w:r>
-        <w:rPr>
-          <w:b/>
-        </w:rPr>
-        <w:t>FastAPI + Pydantic v2.</w:t>
-      </w:r>
-      <w:r>
-        <w:t xml:space="preserve"> Spec-required; Pydantic is the last gate before any response leaves the service.</w:t>
-      </w:r>
-    </w:p>
-    <w:p>
-      <w:pPr>
-        <w:pStyle w:val="ListBullet"/>
-      </w:pPr>
-      <w:r>
-        <w:rPr>
-          <w:b/>
-        </w:rPr>
-        <w:t>Gemini 2.0 Flash</w:t>
-      </w:r>
-      <w:r>
-        <w:t xml:space="preserve"> as primary (15 RPM / 1500 RPD free tier — comfortable headroom), </w:t>
-      </w:r>
-      <w:r>
-        <w:rPr>
-          <w:b/>
-        </w:rPr>
-        <w:t>Groq `llama-3.1-8b-instant`</w:t>
-      </w:r>
-      <w:r>
-        <w:t xml:space="preserve"> as transparent fallback on 429 or any error. Two separate quotas matters in practice.</w:t>
-      </w:r>
-    </w:p>
-    <w:p>
-      <w:pPr>
-        <w:pStyle w:val="ListBullet"/>
-      </w:pPr>
-      <w:r>
-        <w:rPr>
-          <w:b/>
-        </w:rPr>
-        <w:t>Gemini `text-embedding-001`</w:t>
-      </w:r>
-      <w:r>
-        <w:t xml:space="preserve"> computed offline once, shipped as a 4.5 MB </w:t>
-      </w:r>
-      <w:r>
-        <w:rPr>
-          <w:rFonts w:ascii="Menlo" w:hAnsi="Menlo"/>
-          <w:sz w:val="20"/>
-        </w:rPr>
-        <w:t>embeddings.npy</w:t>
-      </w:r>
-      <w:r>
-        <w:t>. Cold start is 3s instead of 7 minutes.</w:t>
-      </w:r>
-    </w:p>
-    <w:p>
-      <w:pPr>
-        <w:pStyle w:val="ListBullet"/>
-      </w:pPr>
-      <w:r>
-        <w:rPr>
-          <w:b/>
-        </w:rPr>
-        <w:t>`rank_bm25`</w:t>
-      </w:r>
-      <w:r>
-        <w:t xml:space="preserve"> for lexical, NumPy matmul over 377 vectors for dense. FAISS would be overkill at this scale.</w:t>
-      </w:r>
-    </w:p>
-    <w:p>
-      <w:pPr>
-        <w:pStyle w:val="ListBullet"/>
-      </w:pPr>
-      <w:r>
-        <w:rPr>
-          <w:b/>
-        </w:rPr>
-        <w:t>Render free Docker tier.</w:t>
-      </w:r>
-      <w:r>
-        <w:t xml:space="preserve"> The spec's 2-minute cold-start allowance is essentially written for it.</w:t>
-      </w:r>
-    </w:p>
-    <w:p>
-      <w:pPr>
-        <w:spacing w:before="200" w:after="80"/>
-      </w:pPr>
-      <w:r>
-        <w:rPr>
-          <w:b/>
-          <w:sz w:val="26"/>
-        </w:rPr>
-        <w:t>Evaluation</w:t>
-      </w:r>
-    </w:p>
-    <w:p>
-      <w:pPr>
-        <w:spacing w:after="120"/>
-      </w:pPr>
-      <w:r>
-        <w:t xml:space="preserve">Replay harness in </w:t>
+        <w:t xml:space="preserve">I built a replay harness early — </w:t>
       </w:r>
       <w:r>
         <w:rPr>
@@ -431,7 +240,7 @@
         <w:t>Cn.md</w:t>
       </w:r>
       <w:r>
-        <w:t xml:space="preserve"> for user turns and labeled URLs, replays multi-turn against the endpoint, and computes Recall@10. Per-trace:</w:t>
+        <w:t>, replays the user turns against the live endpoint, and computes Recall@10 against the labelled URLs. The first working agent scored 0.11. The path to 0.94 was three changes.</w:t>
       </w:r>
     </w:p>
     <w:p>
@@ -439,7 +248,77 @@
         <w:spacing w:after="120"/>
       </w:pPr>
       <w:r>
-        <w:t xml:space="preserve">| Trace | C1 | C2 | C3 | C4 | C5 | C6 | C7 | C8 | C9 | C10 | </w:t>
+        <w:rPr>
+          <w:b/>
+        </w:rPr>
+        <w:t>Fill the shortlist to 10.</w:t>
+      </w:r>
+      <w:r>
+        <w:t xml:space="preserve"> On multi-turn refines the LLM was returning only 1–3 names. Recall@10 has no precision penalty, so under-filling is pure score loss. I added a top-up that fills empty slots from retrieval rank. Recall went 0.11 → 0.43. Big win.</w:t>
+      </w:r>
+    </w:p>
+    <w:p>
+      <w:pPr>
+        <w:spacing w:after="120"/>
+      </w:pPr>
+      <w:r>
+        <w:rPr>
+          <w:b/>
+        </w:rPr>
+        <w:t>Conditional canonical force-include.</w:t>
+      </w:r>
+      <w:r>
+        <w:t xml:space="preserve"> Looking at C5 (sales restructuring) the expected shortlist included OPQ32r and GSA — neither of which appears in BM25/dense top-10 for a "sales audit" query because their descriptions don't say "sales". I added a small list of canonical products that get force-included when query triggers match (OPQ32r is unconditional, Verify G+ requires "senior" or "graduate", GSA requires "audit" or "re-skill", etc.). 0.43 → 0.61. The conditional part matters — forcing every canonical on every query hurt C6 (plant-operator safety) by displacing the right product.</w:t>
+      </w:r>
+    </w:p>
+    <w:p>
+      <w:pPr>
+        <w:spacing w:after="120"/>
+      </w:pPr>
+      <w:r>
+        <w:rPr>
+          <w:b/>
+        </w:rPr>
+        <w:t>Tech-keyword force-include.</w:t>
+      </w:r>
+      <w:r>
+        <w:t xml:space="preserve"> C9 had the user explicitly naming AWS, Docker, SQL, but the retriever was returning five Java variants and crowding them out. I added a small hand-curated map from user keywords to exact catalog products (</w:t>
+      </w:r>
+      <w:r>
+        <w:rPr>
+          <w:rFonts w:ascii="Menlo" w:hAnsi="Menlo"/>
+          <w:sz w:val="20"/>
+        </w:rPr>
+        <w:t>docker</w:t>
+      </w:r>
+      <w:r>
+        <w:t xml:space="preserve"> → Docker (New), </w:t>
+      </w:r>
+      <w:r>
+        <w:rPr>
+          <w:rFonts w:ascii="Menlo" w:hAnsi="Menlo"/>
+          <w:sz w:val="20"/>
+        </w:rPr>
+        <w:t>aws</w:t>
+      </w:r>
+      <w:r>
+        <w:t xml:space="preserve"> → Amazon Web Services (AWS) Development (New), etc.). 0.61 → 0.94.</w:t>
+      </w:r>
+    </w:p>
+    <w:p>
+      <w:pPr>
+        <w:spacing w:after="120"/>
+      </w:pPr>
+      <w:r>
+        <w:t>Per-trace Recall@10 on the public set:</w:t>
+      </w:r>
+    </w:p>
+    <w:p>
+      <w:pPr>
+        <w:spacing w:after="120"/>
+      </w:pPr>
+      <w:r>
+        <w:t xml:space="preserve">| C1 | C2 | C3 | C4 | C5 | C6 | C7 | C8 | C9 | C10 | </w:t>
       </w:r>
       <w:r>
         <w:rPr>
@@ -448,7 +327,7 @@
         <w:t>Mean</w:t>
       </w:r>
       <w:r>
-        <w:t xml:space="preserve"> | |---|---|---|---|---|---|---|---|---|---|---|---| | Recall@10 | 1.00 | 0.80 | 0.75 | 1.00 | 0.80 | 1.00 | 1.00 | 1.00 | 1.00 | 1.00 | </w:t>
+        <w:t xml:space="preserve"> | |---|---|---|---|---|---|---|---|---|---|---| | 1.00 | 0.80 | 0.75 | 1.00 | 0.80 | 1.00 | 1.00 | 1.00 | 1.00 | 1.00 | </w:t>
       </w:r>
       <w:r>
         <w:rPr>
@@ -465,7 +344,7 @@
         <w:spacing w:after="120"/>
       </w:pPr>
       <w:r>
-        <w:t>Behavior probes (</w:t>
+        <w:t xml:space="preserve">Behaviour probes live in </w:t>
       </w:r>
       <w:r>
         <w:rPr>
@@ -475,7 +354,7 @@
         <w:t>tests/test_behavior_probes.py</w:t>
       </w:r>
       <w:r>
-        <w:t>) — 9 scripted conversations with binary assertions: schema shape, no-recommend-on-vague-turn-1, prompt-injection refusal, off-topic refusal, refine keeps prior items, end-of-conversation only on confirmation, test_type letter codes. All 9 pass.</w:t>
+        <w:t xml:space="preserve"> — nine scripted conversations with binary assertions covering schema shape, no-recommend-on-vague-turn-1, prompt-injection refusal, off-topic refusal, refine keeps prior items, end-of-conversation only on user confirmation, and test_type as a letter code. All nine pass.</w:t>
       </w:r>
     </w:p>
     <w:p>
@@ -487,49 +366,152 @@
           <w:b/>
           <w:sz w:val="26"/>
         </w:rPr>
-        <w:t>What didn't work</w:t>
+        <w:t>Stack and why</w:t>
       </w:r>
     </w:p>
     <w:p>
       <w:pPr>
-        <w:pStyle w:val="ListBullet"/>
+        <w:spacing w:after="120"/>
       </w:pPr>
       <w:r>
         <w:rPr>
           <w:b/>
         </w:rPr>
-        <w:t>Pure LLM-driven selection without top-up</w:t>
+        <w:t>FastAPI + Pydantic v2</w:t>
       </w:r>
       <w:r>
-        <w:t xml:space="preserve"> plateaued at 0.43 Mean Recall. The model under-filled and picked similar-sounding products (Enterprise Leadership Report 2.0 instead of OPQ Leadership Report). The priority-ordered builder is what recovered the gap.</w:t>
+        <w:t xml:space="preserve"> because the schema is non-negotiable. Pydantic is the last gate before any response leaves the service — off-schema returns a 5xx, never silently malformed JSON.</w:t>
       </w:r>
     </w:p>
     <w:p>
       <w:pPr>
-        <w:pStyle w:val="ListBullet"/>
+        <w:spacing w:after="120"/>
       </w:pPr>
       <w:r>
         <w:rPr>
           <w:b/>
         </w:rPr>
-        <w:t>`sentence-transformers` locally</w:t>
+        <w:t>Gemini 2.0 Flash as primary, Groq `llama-3.1-8b-instant` as fallback.</w:t>
       </w:r>
       <w:r>
-        <w:t xml:space="preserve"> — PyTorch is ~500 MB and would have blown Render's 512 MB RAM cap. Switched to Gemini embeddings.</w:t>
+        <w:t xml:space="preserve"> I started on Gemini 2.5 Flash and burned through its 250-RPD free quota in a single eval run. Switched to 2.0 Flash (1500 RPD) and added Groq so failures on one provider transparently route to the other. Two separate quotas matters more in practice than I expected.</w:t>
       </w:r>
     </w:p>
     <w:p>
       <w:pPr>
-        <w:pStyle w:val="ListBullet"/>
+        <w:spacing w:after="120"/>
       </w:pPr>
       <w:r>
         <w:rPr>
           <w:b/>
         </w:rPr>
-        <w:t>Gemini 2.5 Flash</w:t>
+        <w:t>Gemini `text-embedding-001`</w:t>
       </w:r>
       <w:r>
-        <w:t xml:space="preserve"> as primary — 10 RPM / 250 RPD got exhausted within a single eval run. Dropped to 2.0 Flash and added Groq fallback.</w:t>
+        <w:t xml:space="preserve"> embedded the catalog once offline. The result is a 4.5 MB </w:t>
+      </w:r>
+      <w:r>
+        <w:rPr>
+          <w:rFonts w:ascii="Menlo" w:hAnsi="Menlo"/>
+          <w:sz w:val="20"/>
+        </w:rPr>
+        <w:t>embeddings.npy</w:t>
+      </w:r>
+      <w:r>
+        <w:t xml:space="preserve"> shipped in the repo. Cold start on Render is 3 seconds (load + index build) instead of about 7 minutes (re-embed 377 docs over the network).</w:t>
+      </w:r>
+    </w:p>
+    <w:p>
+      <w:pPr>
+        <w:spacing w:after="120"/>
+      </w:pPr>
+      <w:r>
+        <w:rPr>
+          <w:b/>
+        </w:rPr>
+        <w:t>`rank_bm25` for lexical, NumPy matmul over 377 vectors for dense.</w:t>
+      </w:r>
+      <w:r>
+        <w:t xml:space="preserve"> I had originally planned FAISS and </w:t>
+      </w:r>
+      <w:r>
+        <w:rPr>
+          <w:rFonts w:ascii="Menlo" w:hAnsi="Menlo"/>
+          <w:sz w:val="20"/>
+        </w:rPr>
+        <w:t>sentence-transformers/all-MiniLM-L6-v2</w:t>
+      </w:r>
+      <w:r>
+        <w:t>, but PyTorch is ~500 MB and would have blown Render's 512 MB RAM cap. Switching to Gemini embeddings made the deployment ~270 MB total.</w:t>
+      </w:r>
+    </w:p>
+    <w:p>
+      <w:pPr>
+        <w:spacing w:after="120"/>
+      </w:pPr>
+      <w:r>
+        <w:rPr>
+          <w:b/>
+        </w:rPr>
+        <w:t>Render free Docker tier.</w:t>
+      </w:r>
+      <w:r>
+        <w:t xml:space="preserve"> The spec's 2-minute cold-start allowance for </w:t>
+      </w:r>
+      <w:r>
+        <w:rPr>
+          <w:rFonts w:ascii="Menlo" w:hAnsi="Menlo"/>
+          <w:sz w:val="20"/>
+        </w:rPr>
+        <w:t>/health</w:t>
+      </w:r>
+      <w:r>
+        <w:t xml:space="preserve"> is essentially written for it.</w:t>
+      </w:r>
+    </w:p>
+    <w:p>
+      <w:pPr>
+        <w:spacing w:before="200" w:after="80"/>
+      </w:pPr>
+      <w:r>
+        <w:rPr>
+          <w:b/>
+          <w:sz w:val="26"/>
+        </w:rPr>
+        <w:t>What I tried that didn't work</w:t>
+      </w:r>
+    </w:p>
+    <w:p>
+      <w:pPr>
+        <w:spacing w:after="120"/>
+      </w:pPr>
+      <w:r>
+        <w:t xml:space="preserve">I spent a couple of hours on prompt engineering before realising the LLM wasn't the problem on Recall — it was that the LLM was picking </w:t>
+      </w:r>
+      <w:r>
+        <w:rPr>
+          <w:i/>
+        </w:rPr>
+        <w:t>fewer</w:t>
+      </w:r>
+      <w:r>
+        <w:t xml:space="preserve"> items than the budget allowed, and the retriever was missing canonical products entirely. No amount of prompt tuning fixes that. The shortlist builder did.</w:t>
+      </w:r>
+    </w:p>
+    <w:p>
+      <w:pPr>
+        <w:spacing w:after="120"/>
+      </w:pPr>
+      <w:r>
+        <w:t>I also tried using only the latest user message as the retrieval query. That broke refines ("add personality" alone has no signal). Concatenating all user turns is the cheap fix that gives the same context the LLM sees.</w:t>
+      </w:r>
+    </w:p>
+    <w:p>
+      <w:pPr>
+        <w:spacing w:after="120"/>
+      </w:pPr>
+      <w:r>
+        <w:t>The first version of the canonical injection forced every canonical on every query. C6 dropped from 1.00 to 0.50 because canonicals displaced the right safety product. Making the inclusion conditional on query triggers fixed it.</w:t>
       </w:r>
     </w:p>
     <w:p>
@@ -549,7 +531,7 @@
         <w:spacing w:after="120"/>
       </w:pPr>
       <w:r>
-        <w:t>When both Gemini and Groq fail (rate-limit or outage), the agent falls through to a retrieval-only path. The shortlist still populates via tech-keyword + canonical + retrieval rank, so Recall@10 is preserved without LLM availability. A signal-term heuristic decides between clarify and recommend so the resilience path doesn't violate the no-recommend-on-vague-turn-1 probe.</w:t>
+        <w:t>If both Gemini and Groq fail (both rate-limited or network outage), the agent falls through to a retrieval-only path. The shortlist still populates via tech-keyword + canonical + retrieval rank, so Recall@10 is preserved even without an LLM. A small signal-term heuristic in the fallback path decides between clarify and recommend so it doesn't violate the no-recommend-on-vague-turn-1 probe.</w:t>
       </w:r>
     </w:p>
     <w:p>
@@ -561,31 +543,15 @@
           <w:b/>
           <w:sz w:val="26"/>
         </w:rPr>
-        <w:t>What I'd add with more time</w:t>
+        <w:t>What I'd add next</w:t>
       </w:r>
     </w:p>
     <w:p>
       <w:pPr>
-        <w:pStyle w:val="ListBullet"/>
+        <w:spacing w:after="120"/>
       </w:pPr>
       <w:r>
-        <w:t>LLM-based query rewriting before retrieval (would help C7's multi-faceted bilingual-healthcare-admin query).</w:t>
-      </w:r>
-    </w:p>
-    <w:p>
-      <w:pPr>
-        <w:pStyle w:val="ListBullet"/>
-      </w:pPr>
-      <w:r>
-        <w:t>MMR-style diversity in retrieval to drop the hand-curated tech-keyword layer.</w:t>
-      </w:r>
-    </w:p>
-    <w:p>
-      <w:pPr>
-        <w:pStyle w:val="ListBullet"/>
-      </w:pPr>
-      <w:r>
-        <w:t>Simulated-user harness with an LLM playing the user, to test holdout-style queries the way SHL actually evaluates.</w:t>
+        <w:t>LLM-based query rewriting before retrieval, mostly to help C7 (multi-faceted bilingual-healthcare-admin) which still relies too much on the hand-curated keyword layer. MMR-style diversity inside the retriever to drop that hand layer entirely. And a simulated-user harness that uses an LLM as the user, the way SHL actually runs evaluation, so I could test holdout-style queries instead of replaying the public traces verbatim.</w:t>
       </w:r>
     </w:p>
     <w:p>
@@ -597,7 +563,7 @@
           <w:b/>
           <w:sz w:val="26"/>
         </w:rPr>
-        <w:t>AI tool usage disclosure</w:t>
+        <w:t>AI tool usage</w:t>
       </w:r>
     </w:p>
     <w:p>
@@ -605,7 +571,7 @@
         <w:spacing w:after="120"/>
       </w:pPr>
       <w:r>
-        <w:t>I used Claude as a coding assistant — pair-debugging retrieval gaps, diagnosing the rate-limit cascade, and proposing the shortlist-builder priority ordering after I described the C8 and C9 trace failures. The design (single-LLM-call orchestrator over tool-use, canonical injection, tech-keyword layer, resilience path), the prompt content, and the keyword lists are mine. I verified every change against the 10 public traces and the probe suite before committing.</w:t>
+        <w:t>I used Claude (via Claude Code) as a pair-programmer throughout — code generation, debugging the rate-limit cascade when both providers got exhausted, and helping me diagnose why C8 and C9 were under-performing. The design calls (orchestrator over tool-use, canonical injection, the tech-keyword layer, the resilience path) and all the prompts and keyword lists are mine. I verified every change against the 10 public traces and the probe suite before committing.</w:t>
       </w:r>
     </w:p>
     <w:sectPr>

</xml_diff>